<commit_message>
Integrate SelfCheckGPT for hallucination detection and trust calibration
- Add selfcheck.ts with consistency checking simulation
- Add SelfCheckPanel component with per-task analysis
- Update DelegationRules with Stakes/SelfCheck toggle views
- Show confidence scores, warnings, and recommendations
- Display research insight from Manakul et al. paper
</commit_message>
<xml_diff>
--- a/Ruibiao_Anisha_Gyeongbin_Chenxi_Ray_Zhaowen.docx
+++ b/Ruibiao_Anisha_Gyeongbin_Chenxi_Ray_Zhaowen.docx
@@ -583,6 +583,67 @@
     </w:p>
     <w:p>
       <w:pPr>
+        <w:spacing w:before="240" w:after="120" w:line="240" w:lineRule="auto"/>
+        <w:outlineLvl w:val="3"/>
+        <w:rPr>
+          <w:rFonts w:ascii="Times New Roman" w:eastAsia="Times New Roman" w:hAnsi="Times New Roman" w:cs="Times New Roman"/>
+          <w:b/>
+          <w:bCs/>
+          <w:kern w:val="0"/>
+          <w:sz w:val="25"/>
+          <w:szCs w:val="25"/>
+          <w14:ligatures w14:val="none"/>
+        </w:rPr>
+      </w:pPr>
+      <w:r>
+        <w:rPr>
+          <w:rFonts w:ascii="Times New Roman" w:eastAsia="Times New Roman" w:hAnsi="Times New Roman" w:cs="Times New Roman"/>
+          <w:b/>
+          <w:bCs/>
+          <w:kern w:val="0"/>
+          <w:sz w:val="25"/>
+          <w:szCs w:val="25"/>
+          <w14:ligatures w14:val="none"/>
+        </w:rPr>
+        <w:drawing>
+          <wp:inline distT="0" distB="0" distL="0" distR="0" wp14:anchorId="373B08E2" wp14:editId="221FB4CB">
+            <wp:extent cx="4706471" cy="2446664"/>
+            <wp:effectExtent l="0" t="0" r="5715" b="4445"/>
+            <wp:docPr id="2059328350" name="Picture 1" descr="A screenshot of a computer&#10;&#10;AI-generated content may be incorrect."/>
+            <wp:cNvGraphicFramePr>
+              <a:graphicFrameLocks xmlns:a="http://schemas.openxmlformats.org/drawingml/2006/main" noChangeAspect="1"/>
+            </wp:cNvGraphicFramePr>
+            <a:graphic xmlns:a="http://schemas.openxmlformats.org/drawingml/2006/main">
+              <a:graphicData uri="http://schemas.openxmlformats.org/drawingml/2006/picture">
+                <pic:pic xmlns:pic="http://schemas.openxmlformats.org/drawingml/2006/picture">
+                  <pic:nvPicPr>
+                    <pic:cNvPr id="2059328350" name="Picture 1" descr="A screenshot of a computer&#10;&#10;AI-generated content may be incorrect."/>
+                    <pic:cNvPicPr/>
+                  </pic:nvPicPr>
+                  <pic:blipFill>
+                    <a:blip r:embed="rId6"/>
+                    <a:stretch>
+                      <a:fillRect/>
+                    </a:stretch>
+                  </pic:blipFill>
+                  <pic:spPr>
+                    <a:xfrm>
+                      <a:off x="0" y="0"/>
+                      <a:ext cx="4734489" cy="2461229"/>
+                    </a:xfrm>
+                    <a:prstGeom prst="rect">
+                      <a:avLst/>
+                    </a:prstGeom>
+                  </pic:spPr>
+                </pic:pic>
+              </a:graphicData>
+            </a:graphic>
+          </wp:inline>
+        </w:drawing>
+      </w:r>
+    </w:p>
+    <w:p>
+      <w:pPr>
         <w:spacing w:after="0" w:line="240" w:lineRule="auto"/>
         <w:rPr>
           <w:rFonts w:ascii="Times New Roman" w:eastAsia="Times New Roman" w:hAnsi="Times New Roman" w:cs="Times New Roman"/>
@@ -778,50 +839,161 @@
     </w:p>
     <w:p>
       <w:pPr>
-        <w:spacing w:after="0" w:line="240" w:lineRule="auto"/>
-        <w:rPr>
-          <w:rFonts w:ascii="Times New Roman" w:eastAsia="Times New Roman" w:hAnsi="Times New Roman" w:cs="Times New Roman"/>
-          <w:kern w:val="0"/>
-          <w14:ligatures w14:val="none"/>
-        </w:rPr>
-      </w:pPr>
-      <w:r>
+        <w:spacing w:before="240" w:after="120" w:line="240" w:lineRule="auto"/>
+        <w:outlineLvl w:val="3"/>
         <w:rPr>
           <w:rFonts w:ascii="Times New Roman" w:eastAsia="Times New Roman" w:hAnsi="Times New Roman" w:cs="Times New Roman"/>
           <w:b/>
           <w:bCs/>
           <w:kern w:val="0"/>
-          <w14:ligatures w14:val="none"/>
-        </w:rPr>
-        <w:t>"Your process </w:t>
-      </w:r>
-      <w:proofErr w:type="spellStart"/>
+          <w:sz w:val="25"/>
+          <w:szCs w:val="25"/>
+          <w14:ligatures w14:val="none"/>
+        </w:rPr>
+      </w:pPr>
       <w:r>
         <w:rPr>
           <w:rFonts w:ascii="Times New Roman" w:eastAsia="Times New Roman" w:hAnsi="Times New Roman" w:cs="Times New Roman"/>
           <w:b/>
           <w:bCs/>
           <w:kern w:val="0"/>
-          <w14:ligatures w14:val="none"/>
-        </w:rPr>
-        <w:t>framework"</w:t>
-      </w:r>
-      <w:r>
-        <w:rPr>
-          <w:rFonts w:ascii="Times New Roman" w:eastAsia="Times New Roman" w:hAnsi="Times New Roman" w:cs="Times New Roman"/>
-          <w:kern w:val="0"/>
-          <w14:ligatures w14:val="none"/>
-        </w:rPr>
-        <w:t>Users</w:t>
-      </w:r>
-      <w:proofErr w:type="spellEnd"/>
-      <w:r>
-        <w:rPr>
-          <w:rFonts w:ascii="Times New Roman" w:eastAsia="Times New Roman" w:hAnsi="Times New Roman" w:cs="Times New Roman"/>
-          <w:kern w:val="0"/>
-          <w14:ligatures w14:val="none"/>
-        </w:rPr>
-        <w:t xml:space="preserve"> can interact with the task framework:</w:t>
+          <w:sz w:val="25"/>
+          <w:szCs w:val="25"/>
+          <w14:ligatures w14:val="none"/>
+        </w:rPr>
+        <w:drawing>
+          <wp:inline distT="0" distB="0" distL="0" distR="0" wp14:anchorId="25719A52" wp14:editId="162237F2">
+            <wp:extent cx="5024010" cy="3254188"/>
+            <wp:effectExtent l="0" t="0" r="5715" b="0"/>
+            <wp:docPr id="419707534" name="Picture 1" descr="A screenshot of a computer screen&#10;&#10;AI-generated content may be incorrect."/>
+            <wp:cNvGraphicFramePr>
+              <a:graphicFrameLocks xmlns:a="http://schemas.openxmlformats.org/drawingml/2006/main" noChangeAspect="1"/>
+            </wp:cNvGraphicFramePr>
+            <a:graphic xmlns:a="http://schemas.openxmlformats.org/drawingml/2006/main">
+              <a:graphicData uri="http://schemas.openxmlformats.org/drawingml/2006/picture">
+                <pic:pic xmlns:pic="http://schemas.openxmlformats.org/drawingml/2006/picture">
+                  <pic:nvPicPr>
+                    <pic:cNvPr id="419707534" name="Picture 1" descr="A screenshot of a computer screen&#10;&#10;AI-generated content may be incorrect."/>
+                    <pic:cNvPicPr/>
+                  </pic:nvPicPr>
+                  <pic:blipFill>
+                    <a:blip r:embed="rId7"/>
+                    <a:stretch>
+                      <a:fillRect/>
+                    </a:stretch>
+                  </pic:blipFill>
+                  <pic:spPr>
+                    <a:xfrm>
+                      <a:off x="0" y="0"/>
+                      <a:ext cx="5052081" cy="3272371"/>
+                    </a:xfrm>
+                    <a:prstGeom prst="rect">
+                      <a:avLst/>
+                    </a:prstGeom>
+                  </pic:spPr>
+                </pic:pic>
+              </a:graphicData>
+            </a:graphic>
+          </wp:inline>
+        </w:drawing>
+      </w:r>
+    </w:p>
+    <w:p>
+      <w:pPr>
+        <w:spacing w:after="0" w:line="240" w:lineRule="auto"/>
+        <w:rPr>
+          <w:rFonts w:ascii="Times New Roman" w:eastAsia="Times New Roman" w:hAnsi="Times New Roman" w:cs="Times New Roman"/>
+          <w:b/>
+          <w:bCs/>
+          <w:kern w:val="0"/>
+          <w14:ligatures w14:val="none"/>
+        </w:rPr>
+      </w:pPr>
+      <w:r>
+        <w:rPr>
+          <w:rFonts w:ascii="Times New Roman" w:eastAsia="Times New Roman" w:hAnsi="Times New Roman" w:cs="Times New Roman"/>
+          <w:b/>
+          <w:bCs/>
+          <w:kern w:val="0"/>
+          <w14:ligatures w14:val="none"/>
+        </w:rPr>
+        <w:t>"Your process framework"</w:t>
+      </w:r>
+    </w:p>
+    <w:p>
+      <w:pPr>
+        <w:spacing w:after="0" w:line="240" w:lineRule="auto"/>
+        <w:rPr>
+          <w:rFonts w:ascii="Times New Roman" w:eastAsia="Times New Roman" w:hAnsi="Times New Roman" w:cs="Times New Roman"/>
+          <w:b/>
+          <w:bCs/>
+          <w:kern w:val="0"/>
+          <w14:ligatures w14:val="none"/>
+        </w:rPr>
+      </w:pPr>
+      <w:r>
+        <w:rPr>
+          <w:rFonts w:ascii="Times New Roman" w:eastAsia="Times New Roman" w:hAnsi="Times New Roman" w:cs="Times New Roman"/>
+          <w:b/>
+          <w:bCs/>
+          <w:kern w:val="0"/>
+          <w:sz w:val="25"/>
+          <w:szCs w:val="25"/>
+          <w14:ligatures w14:val="none"/>
+        </w:rPr>
+        <w:drawing>
+          <wp:inline distT="0" distB="0" distL="0" distR="0" wp14:anchorId="23130E2E" wp14:editId="74161335">
+            <wp:extent cx="3344731" cy="3003177"/>
+            <wp:effectExtent l="0" t="0" r="0" b="0"/>
+            <wp:docPr id="1794994142" name="Picture 1" descr="A screenshot of a diagram&#10;&#10;AI-generated content may be incorrect."/>
+            <wp:cNvGraphicFramePr>
+              <a:graphicFrameLocks xmlns:a="http://schemas.openxmlformats.org/drawingml/2006/main" noChangeAspect="1"/>
+            </wp:cNvGraphicFramePr>
+            <a:graphic xmlns:a="http://schemas.openxmlformats.org/drawingml/2006/main">
+              <a:graphicData uri="http://schemas.openxmlformats.org/drawingml/2006/picture">
+                <pic:pic xmlns:pic="http://schemas.openxmlformats.org/drawingml/2006/picture">
+                  <pic:nvPicPr>
+                    <pic:cNvPr id="1794994142" name="Picture 1" descr="A screenshot of a diagram&#10;&#10;AI-generated content may be incorrect."/>
+                    <pic:cNvPicPr/>
+                  </pic:nvPicPr>
+                  <pic:blipFill>
+                    <a:blip r:embed="rId8"/>
+                    <a:stretch>
+                      <a:fillRect/>
+                    </a:stretch>
+                  </pic:blipFill>
+                  <pic:spPr>
+                    <a:xfrm>
+                      <a:off x="0" y="0"/>
+                      <a:ext cx="3385495" cy="3039778"/>
+                    </a:xfrm>
+                    <a:prstGeom prst="rect">
+                      <a:avLst/>
+                    </a:prstGeom>
+                  </pic:spPr>
+                </pic:pic>
+              </a:graphicData>
+            </a:graphic>
+          </wp:inline>
+        </w:drawing>
+      </w:r>
+    </w:p>
+    <w:p>
+      <w:pPr>
+        <w:spacing w:after="0" w:line="240" w:lineRule="auto"/>
+        <w:rPr>
+          <w:rFonts w:ascii="Times New Roman" w:eastAsia="Times New Roman" w:hAnsi="Times New Roman" w:cs="Times New Roman"/>
+          <w:kern w:val="0"/>
+          <w14:ligatures w14:val="none"/>
+        </w:rPr>
+      </w:pPr>
+      <w:r>
+        <w:rPr>
+          <w:rFonts w:ascii="Times New Roman" w:eastAsia="Times New Roman" w:hAnsi="Times New Roman" w:cs="Times New Roman"/>
+          <w:kern w:val="0"/>
+          <w14:ligatures w14:val="none"/>
+        </w:rPr>
+        <w:t>Users can interact with the task framework:</w:t>
       </w:r>
     </w:p>
     <w:p>
@@ -966,21 +1138,12 @@
         <w:spacing w:after="0" w:line="240" w:lineRule="auto"/>
         <w:rPr>
           <w:rFonts w:ascii="Times New Roman" w:eastAsia="Times New Roman" w:hAnsi="Times New Roman" w:cs="Times New Roman"/>
-          <w:kern w:val="0"/>
-          <w14:ligatures w14:val="none"/>
-        </w:rPr>
-      </w:pPr>
-      <w:r>
-        <w:rPr>
-          <w:rFonts w:ascii="Times New Roman" w:eastAsia="Times New Roman" w:hAnsi="Times New Roman" w:cs="Times New Roman"/>
           <w:b/>
           <w:bCs/>
           <w:kern w:val="0"/>
           <w14:ligatures w14:val="none"/>
         </w:rPr>
-        <w:t xml:space="preserve">"Who should handle each </w:t>
-      </w:r>
-      <w:proofErr w:type="spellStart"/>
+      </w:pPr>
       <w:r>
         <w:rPr>
           <w:rFonts w:ascii="Times New Roman" w:eastAsia="Times New Roman" w:hAnsi="Times New Roman" w:cs="Times New Roman"/>
@@ -989,24 +1152,151 @@
           <w:kern w:val="0"/>
           <w14:ligatures w14:val="none"/>
         </w:rPr>
-        <w:t>part?"</w:t>
-      </w:r>
-      <w:r>
-        <w:rPr>
-          <w:rFonts w:ascii="Times New Roman" w:eastAsia="Times New Roman" w:hAnsi="Times New Roman" w:cs="Times New Roman"/>
-          <w:kern w:val="0"/>
-          <w14:ligatures w14:val="none"/>
-        </w:rPr>
-        <w:t>Each</w:t>
-      </w:r>
-      <w:proofErr w:type="spellEnd"/>
-      <w:r>
-        <w:rPr>
-          <w:rFonts w:ascii="Times New Roman" w:eastAsia="Times New Roman" w:hAnsi="Times New Roman" w:cs="Times New Roman"/>
-          <w:kern w:val="0"/>
-          <w14:ligatures w14:val="none"/>
-        </w:rPr>
-        <w:t> task displays its delegation status:</w:t>
+        <w:t>"Who should handle each part?"</w:t>
+      </w:r>
+    </w:p>
+    <w:p>
+      <w:pPr>
+        <w:spacing w:after="0" w:line="240" w:lineRule="auto"/>
+        <w:rPr>
+          <w:rFonts w:ascii="Times New Roman" w:eastAsia="Times New Roman" w:hAnsi="Times New Roman" w:cs="Times New Roman"/>
+          <w:b/>
+          <w:bCs/>
+          <w:kern w:val="0"/>
+          <w14:ligatures w14:val="none"/>
+        </w:rPr>
+      </w:pPr>
+      <w:r>
+        <w:rPr>
+          <w:rFonts w:ascii="Times New Roman" w:eastAsia="Times New Roman" w:hAnsi="Times New Roman" w:cs="Times New Roman"/>
+          <w:b/>
+          <w:bCs/>
+          <w:kern w:val="0"/>
+          <w:sz w:val="25"/>
+          <w:szCs w:val="25"/>
+          <w14:ligatures w14:val="none"/>
+        </w:rPr>
+        <w:drawing>
+          <wp:inline distT="0" distB="0" distL="0" distR="0" wp14:anchorId="415BD810" wp14:editId="7B7CBB18">
+            <wp:extent cx="4320988" cy="3794955"/>
+            <wp:effectExtent l="0" t="0" r="0" b="2540"/>
+            <wp:docPr id="1081562152" name="Picture 1" descr="A screenshot of a computer&#10;&#10;AI-generated content may be incorrect."/>
+            <wp:cNvGraphicFramePr>
+              <a:graphicFrameLocks xmlns:a="http://schemas.openxmlformats.org/drawingml/2006/main" noChangeAspect="1"/>
+            </wp:cNvGraphicFramePr>
+            <a:graphic xmlns:a="http://schemas.openxmlformats.org/drawingml/2006/main">
+              <a:graphicData uri="http://schemas.openxmlformats.org/drawingml/2006/picture">
+                <pic:pic xmlns:pic="http://schemas.openxmlformats.org/drawingml/2006/picture">
+                  <pic:nvPicPr>
+                    <pic:cNvPr id="1081562152" name="Picture 1" descr="A screenshot of a computer&#10;&#10;AI-generated content may be incorrect."/>
+                    <pic:cNvPicPr/>
+                  </pic:nvPicPr>
+                  <pic:blipFill>
+                    <a:blip r:embed="rId9"/>
+                    <a:stretch>
+                      <a:fillRect/>
+                    </a:stretch>
+                  </pic:blipFill>
+                  <pic:spPr>
+                    <a:xfrm>
+                      <a:off x="0" y="0"/>
+                      <a:ext cx="4349070" cy="3819618"/>
+                    </a:xfrm>
+                    <a:prstGeom prst="rect">
+                      <a:avLst/>
+                    </a:prstGeom>
+                  </pic:spPr>
+                </pic:pic>
+              </a:graphicData>
+            </a:graphic>
+          </wp:inline>
+        </w:drawing>
+      </w:r>
+    </w:p>
+    <w:p>
+      <w:pPr>
+        <w:spacing w:after="0" w:line="240" w:lineRule="auto"/>
+        <w:rPr>
+          <w:rFonts w:ascii="Times New Roman" w:eastAsia="Times New Roman" w:hAnsi="Times New Roman" w:cs="Times New Roman"/>
+          <w:b/>
+          <w:bCs/>
+          <w:kern w:val="0"/>
+          <w14:ligatures w14:val="none"/>
+        </w:rPr>
+      </w:pPr>
+      <w:r>
+        <w:rPr>
+          <w:rFonts w:ascii="Times New Roman" w:eastAsia="Times New Roman" w:hAnsi="Times New Roman" w:cs="Times New Roman"/>
+          <w:b/>
+          <w:bCs/>
+          <w:kern w:val="0"/>
+          <w14:ligatures w14:val="none"/>
+        </w:rPr>
+        <w:drawing>
+          <wp:inline distT="0" distB="0" distL="0" distR="0" wp14:anchorId="39BF7F9D" wp14:editId="4065B70A">
+            <wp:extent cx="4305206" cy="2115671"/>
+            <wp:effectExtent l="0" t="0" r="635" b="5715"/>
+            <wp:docPr id="489420383" name="Picture 1" descr="A screenshot of a computer&#10;&#10;AI-generated content may be incorrect."/>
+            <wp:cNvGraphicFramePr>
+              <a:graphicFrameLocks xmlns:a="http://schemas.openxmlformats.org/drawingml/2006/main" noChangeAspect="1"/>
+            </wp:cNvGraphicFramePr>
+            <a:graphic xmlns:a="http://schemas.openxmlformats.org/drawingml/2006/main">
+              <a:graphicData uri="http://schemas.openxmlformats.org/drawingml/2006/picture">
+                <pic:pic xmlns:pic="http://schemas.openxmlformats.org/drawingml/2006/picture">
+                  <pic:nvPicPr>
+                    <pic:cNvPr id="489420383" name="Picture 1" descr="A screenshot of a computer&#10;&#10;AI-generated content may be incorrect."/>
+                    <pic:cNvPicPr/>
+                  </pic:nvPicPr>
+                  <pic:blipFill>
+                    <a:blip r:embed="rId10"/>
+                    <a:stretch>
+                      <a:fillRect/>
+                    </a:stretch>
+                  </pic:blipFill>
+                  <pic:spPr>
+                    <a:xfrm>
+                      <a:off x="0" y="0"/>
+                      <a:ext cx="4373271" cy="2149120"/>
+                    </a:xfrm>
+                    <a:prstGeom prst="rect">
+                      <a:avLst/>
+                    </a:prstGeom>
+                  </pic:spPr>
+                </pic:pic>
+              </a:graphicData>
+            </a:graphic>
+          </wp:inline>
+        </w:drawing>
+      </w:r>
+    </w:p>
+    <w:p>
+      <w:pPr>
+        <w:spacing w:after="0" w:line="240" w:lineRule="auto"/>
+        <w:rPr>
+          <w:rFonts w:ascii="Times New Roman" w:eastAsia="Times New Roman" w:hAnsi="Times New Roman" w:cs="Times New Roman"/>
+          <w:b/>
+          <w:bCs/>
+          <w:kern w:val="0"/>
+          <w14:ligatures w14:val="none"/>
+        </w:rPr>
+      </w:pPr>
+    </w:p>
+    <w:p>
+      <w:pPr>
+        <w:spacing w:after="0" w:line="240" w:lineRule="auto"/>
+        <w:rPr>
+          <w:rFonts w:ascii="Times New Roman" w:eastAsia="Times New Roman" w:hAnsi="Times New Roman" w:cs="Times New Roman"/>
+          <w:kern w:val="0"/>
+          <w14:ligatures w14:val="none"/>
+        </w:rPr>
+      </w:pPr>
+      <w:r>
+        <w:rPr>
+          <w:rFonts w:ascii="Times New Roman" w:eastAsia="Times New Roman" w:hAnsi="Times New Roman" w:cs="Times New Roman"/>
+          <w:kern w:val="0"/>
+          <w14:ligatures w14:val="none"/>
+        </w:rPr>
+        <w:t>Each task displays its delegation status:</w:t>
       </w:r>
     </w:p>
     <w:p>
@@ -1304,21 +1594,12 @@
         <w:spacing w:after="0" w:line="240" w:lineRule="auto"/>
         <w:rPr>
           <w:rFonts w:ascii="Times New Roman" w:eastAsia="Times New Roman" w:hAnsi="Times New Roman" w:cs="Times New Roman"/>
-          <w:kern w:val="0"/>
-          <w14:ligatures w14:val="none"/>
-        </w:rPr>
-      </w:pPr>
-      <w:r>
-        <w:rPr>
-          <w:rFonts w:ascii="Times New Roman" w:eastAsia="Times New Roman" w:hAnsi="Times New Roman" w:cs="Times New Roman"/>
           <w:b/>
           <w:bCs/>
           <w:kern w:val="0"/>
           <w14:ligatures w14:val="none"/>
         </w:rPr>
-        <w:t xml:space="preserve">"Control &amp; </w:t>
-      </w:r>
-      <w:proofErr w:type="spellStart"/>
+      </w:pPr>
       <w:r>
         <w:rPr>
           <w:rFonts w:ascii="Times New Roman" w:eastAsia="Times New Roman" w:hAnsi="Times New Roman" w:cs="Times New Roman"/>
@@ -1327,24 +1608,208 @@
           <w:kern w:val="0"/>
           <w14:ligatures w14:val="none"/>
         </w:rPr>
-        <w:t>safety"</w:t>
-      </w:r>
-      <w:r>
-        <w:rPr>
-          <w:rFonts w:ascii="Times New Roman" w:eastAsia="Times New Roman" w:hAnsi="Times New Roman" w:cs="Times New Roman"/>
-          <w:kern w:val="0"/>
-          <w14:ligatures w14:val="none"/>
-        </w:rPr>
-        <w:t>Demonstrates</w:t>
-      </w:r>
-      <w:proofErr w:type="spellEnd"/>
-      <w:r>
-        <w:rPr>
-          <w:rFonts w:ascii="Times New Roman" w:eastAsia="Times New Roman" w:hAnsi="Times New Roman" w:cs="Times New Roman"/>
-          <w:kern w:val="0"/>
-          <w14:ligatures w14:val="none"/>
-        </w:rPr>
-        <w:t> safety controls:</w:t>
+        <w:t>"Control &amp; safety"</w:t>
+      </w:r>
+    </w:p>
+    <w:p>
+      <w:pPr>
+        <w:spacing w:before="240" w:after="120" w:line="240" w:lineRule="auto"/>
+        <w:outlineLvl w:val="3"/>
+        <w:rPr>
+          <w:rFonts w:ascii="Times New Roman" w:eastAsia="Times New Roman" w:hAnsi="Times New Roman" w:cs="Times New Roman"/>
+          <w:b/>
+          <w:bCs/>
+          <w:kern w:val="0"/>
+          <w:sz w:val="25"/>
+          <w:szCs w:val="25"/>
+          <w14:ligatures w14:val="none"/>
+        </w:rPr>
+      </w:pPr>
+      <w:r>
+        <w:rPr>
+          <w:rFonts w:ascii="Times New Roman" w:eastAsia="Times New Roman" w:hAnsi="Times New Roman" w:cs="Times New Roman"/>
+          <w:b/>
+          <w:bCs/>
+          <w:kern w:val="0"/>
+          <w:sz w:val="25"/>
+          <w:szCs w:val="25"/>
+          <w14:ligatures w14:val="none"/>
+        </w:rPr>
+        <w:drawing>
+          <wp:inline distT="0" distB="0" distL="0" distR="0" wp14:anchorId="278F94F9" wp14:editId="1A0D3A4E">
+            <wp:extent cx="3953435" cy="2189747"/>
+            <wp:effectExtent l="0" t="0" r="0" b="0"/>
+            <wp:docPr id="348212318" name="Picture 1" descr="A screenshot of a phone&#10;&#10;AI-generated content may be incorrect."/>
+            <wp:cNvGraphicFramePr>
+              <a:graphicFrameLocks xmlns:a="http://schemas.openxmlformats.org/drawingml/2006/main" noChangeAspect="1"/>
+            </wp:cNvGraphicFramePr>
+            <a:graphic xmlns:a="http://schemas.openxmlformats.org/drawingml/2006/main">
+              <a:graphicData uri="http://schemas.openxmlformats.org/drawingml/2006/picture">
+                <pic:pic xmlns:pic="http://schemas.openxmlformats.org/drawingml/2006/picture">
+                  <pic:nvPicPr>
+                    <pic:cNvPr id="348212318" name="Picture 1" descr="A screenshot of a phone&#10;&#10;AI-generated content may be incorrect."/>
+                    <pic:cNvPicPr/>
+                  </pic:nvPicPr>
+                  <pic:blipFill>
+                    <a:blip r:embed="rId11"/>
+                    <a:stretch>
+                      <a:fillRect/>
+                    </a:stretch>
+                  </pic:blipFill>
+                  <pic:spPr>
+                    <a:xfrm>
+                      <a:off x="0" y="0"/>
+                      <a:ext cx="3998916" cy="2214938"/>
+                    </a:xfrm>
+                    <a:prstGeom prst="rect">
+                      <a:avLst/>
+                    </a:prstGeom>
+                  </pic:spPr>
+                </pic:pic>
+              </a:graphicData>
+            </a:graphic>
+          </wp:inline>
+        </w:drawing>
+      </w:r>
+    </w:p>
+    <w:p>
+      <w:pPr>
+        <w:spacing w:before="240" w:after="120" w:line="240" w:lineRule="auto"/>
+        <w:outlineLvl w:val="3"/>
+        <w:rPr>
+          <w:rFonts w:ascii="Times New Roman" w:eastAsia="Times New Roman" w:hAnsi="Times New Roman" w:cs="Times New Roman"/>
+          <w:b/>
+          <w:bCs/>
+          <w:kern w:val="0"/>
+          <w:sz w:val="25"/>
+          <w:szCs w:val="25"/>
+          <w14:ligatures w14:val="none"/>
+        </w:rPr>
+      </w:pPr>
+      <w:r>
+        <w:rPr>
+          <w:rFonts w:ascii="Times New Roman" w:eastAsia="Times New Roman" w:hAnsi="Times New Roman" w:cs="Times New Roman"/>
+          <w:b/>
+          <w:bCs/>
+          <w:kern w:val="0"/>
+          <w:sz w:val="25"/>
+          <w:szCs w:val="25"/>
+          <w14:ligatures w14:val="none"/>
+        </w:rPr>
+        <w:drawing>
+          <wp:inline distT="0" distB="0" distL="0" distR="0" wp14:anchorId="00FEC2CE" wp14:editId="7511A7B1">
+            <wp:extent cx="3989294" cy="2495766"/>
+            <wp:effectExtent l="0" t="0" r="0" b="6350"/>
+            <wp:docPr id="1594538211" name="Picture 1" descr="A screenshot of a checklist&#10;&#10;AI-generated content may be incorrect."/>
+            <wp:cNvGraphicFramePr>
+              <a:graphicFrameLocks xmlns:a="http://schemas.openxmlformats.org/drawingml/2006/main" noChangeAspect="1"/>
+            </wp:cNvGraphicFramePr>
+            <a:graphic xmlns:a="http://schemas.openxmlformats.org/drawingml/2006/main">
+              <a:graphicData uri="http://schemas.openxmlformats.org/drawingml/2006/picture">
+                <pic:pic xmlns:pic="http://schemas.openxmlformats.org/drawingml/2006/picture">
+                  <pic:nvPicPr>
+                    <pic:cNvPr id="1594538211" name="Picture 1" descr="A screenshot of a checklist&#10;&#10;AI-generated content may be incorrect."/>
+                    <pic:cNvPicPr/>
+                  </pic:nvPicPr>
+                  <pic:blipFill>
+                    <a:blip r:embed="rId12"/>
+                    <a:stretch>
+                      <a:fillRect/>
+                    </a:stretch>
+                  </pic:blipFill>
+                  <pic:spPr>
+                    <a:xfrm>
+                      <a:off x="0" y="0"/>
+                      <a:ext cx="4029878" cy="2521156"/>
+                    </a:xfrm>
+                    <a:prstGeom prst="rect">
+                      <a:avLst/>
+                    </a:prstGeom>
+                  </pic:spPr>
+                </pic:pic>
+              </a:graphicData>
+            </a:graphic>
+          </wp:inline>
+        </w:drawing>
+      </w:r>
+    </w:p>
+    <w:p>
+      <w:pPr>
+        <w:spacing w:before="240" w:after="120" w:line="240" w:lineRule="auto"/>
+        <w:outlineLvl w:val="3"/>
+        <w:rPr>
+          <w:rFonts w:ascii="Times New Roman" w:eastAsia="Times New Roman" w:hAnsi="Times New Roman" w:cs="Times New Roman"/>
+          <w:b/>
+          <w:bCs/>
+          <w:kern w:val="0"/>
+          <w:sz w:val="25"/>
+          <w:szCs w:val="25"/>
+          <w14:ligatures w14:val="none"/>
+        </w:rPr>
+      </w:pPr>
+      <w:r>
+        <w:rPr>
+          <w:rFonts w:ascii="Times New Roman" w:eastAsia="Times New Roman" w:hAnsi="Times New Roman" w:cs="Times New Roman"/>
+          <w:b/>
+          <w:bCs/>
+          <w:kern w:val="0"/>
+          <w:sz w:val="25"/>
+          <w:szCs w:val="25"/>
+          <w14:ligatures w14:val="none"/>
+        </w:rPr>
+        <w:drawing>
+          <wp:inline distT="0" distB="0" distL="0" distR="0" wp14:anchorId="138D486B" wp14:editId="52286607">
+            <wp:extent cx="4007224" cy="2242437"/>
+            <wp:effectExtent l="0" t="0" r="0" b="5715"/>
+            <wp:docPr id="967030399" name="Picture 1" descr="A screenshot of a phone&#10;&#10;AI-generated content may be incorrect."/>
+            <wp:cNvGraphicFramePr>
+              <a:graphicFrameLocks xmlns:a="http://schemas.openxmlformats.org/drawingml/2006/main" noChangeAspect="1"/>
+            </wp:cNvGraphicFramePr>
+            <a:graphic xmlns:a="http://schemas.openxmlformats.org/drawingml/2006/main">
+              <a:graphicData uri="http://schemas.openxmlformats.org/drawingml/2006/picture">
+                <pic:pic xmlns:pic="http://schemas.openxmlformats.org/drawingml/2006/picture">
+                  <pic:nvPicPr>
+                    <pic:cNvPr id="967030399" name="Picture 1" descr="A screenshot of a phone&#10;&#10;AI-generated content may be incorrect."/>
+                    <pic:cNvPicPr/>
+                  </pic:nvPicPr>
+                  <pic:blipFill>
+                    <a:blip r:embed="rId13"/>
+                    <a:stretch>
+                      <a:fillRect/>
+                    </a:stretch>
+                  </pic:blipFill>
+                  <pic:spPr>
+                    <a:xfrm>
+                      <a:off x="0" y="0"/>
+                      <a:ext cx="4033322" cy="2257042"/>
+                    </a:xfrm>
+                    <a:prstGeom prst="rect">
+                      <a:avLst/>
+                    </a:prstGeom>
+                  </pic:spPr>
+                </pic:pic>
+              </a:graphicData>
+            </a:graphic>
+          </wp:inline>
+        </w:drawing>
+      </w:r>
+    </w:p>
+    <w:p>
+      <w:pPr>
+        <w:spacing w:after="0" w:line="240" w:lineRule="auto"/>
+        <w:rPr>
+          <w:rFonts w:ascii="Times New Roman" w:eastAsia="Times New Roman" w:hAnsi="Times New Roman" w:cs="Times New Roman"/>
+          <w:kern w:val="0"/>
+          <w14:ligatures w14:val="none"/>
+        </w:rPr>
+      </w:pPr>
+      <w:r>
+        <w:rPr>
+          <w:rFonts w:ascii="Times New Roman" w:eastAsia="Times New Roman" w:hAnsi="Times New Roman" w:cs="Times New Roman"/>
+          <w:kern w:val="0"/>
+          <w14:ligatures w14:val="none"/>
+        </w:rPr>
+        <w:t>Demonstrates safety controls:</w:t>
       </w:r>
     </w:p>
     <w:p>
@@ -1583,21 +2048,12 @@
         <w:spacing w:after="0" w:line="240" w:lineRule="auto"/>
         <w:rPr>
           <w:rFonts w:ascii="Times New Roman" w:eastAsia="Times New Roman" w:hAnsi="Times New Roman" w:cs="Times New Roman"/>
-          <w:kern w:val="0"/>
-          <w14:ligatures w14:val="none"/>
-        </w:rPr>
-      </w:pPr>
-      <w:r>
-        <w:rPr>
-          <w:rFonts w:ascii="Times New Roman" w:eastAsia="Times New Roman" w:hAnsi="Times New Roman" w:cs="Times New Roman"/>
           <w:b/>
           <w:bCs/>
           <w:kern w:val="0"/>
           <w14:ligatures w14:val="none"/>
         </w:rPr>
-        <w:t xml:space="preserve">"What you </w:t>
-      </w:r>
-      <w:proofErr w:type="spellStart"/>
+      </w:pPr>
       <w:r>
         <w:rPr>
           <w:rFonts w:ascii="Times New Roman" w:eastAsia="Times New Roman" w:hAnsi="Times New Roman" w:cs="Times New Roman"/>
@@ -1606,24 +2062,205 @@
           <w:kern w:val="0"/>
           <w14:ligatures w14:val="none"/>
         </w:rPr>
-        <w:t>learned"</w:t>
-      </w:r>
-      <w:r>
-        <w:rPr>
-          <w:rFonts w:ascii="Times New Roman" w:eastAsia="Times New Roman" w:hAnsi="Times New Roman" w:cs="Times New Roman"/>
-          <w:kern w:val="0"/>
-          <w14:ligatures w14:val="none"/>
-        </w:rPr>
-        <w:t>Summarizes</w:t>
-      </w:r>
-      <w:proofErr w:type="spellEnd"/>
-      <w:r>
-        <w:rPr>
-          <w:rFonts w:ascii="Times New Roman" w:eastAsia="Times New Roman" w:hAnsi="Times New Roman" w:cs="Times New Roman"/>
-          <w:kern w:val="0"/>
-          <w14:ligatures w14:val="none"/>
-        </w:rPr>
-        <w:t xml:space="preserve"> the session:</w:t>
+        <w:t>"What you learned"</w:t>
+      </w:r>
+    </w:p>
+    <w:p>
+      <w:pPr>
+        <w:spacing w:after="0" w:line="240" w:lineRule="auto"/>
+        <w:rPr>
+          <w:rFonts w:ascii="Times New Roman" w:eastAsia="Times New Roman" w:hAnsi="Times New Roman" w:cs="Times New Roman"/>
+          <w:b/>
+          <w:bCs/>
+          <w:kern w:val="0"/>
+          <w14:ligatures w14:val="none"/>
+        </w:rPr>
+      </w:pPr>
+      <w:r>
+        <w:rPr>
+          <w:rFonts w:ascii="Times New Roman" w:eastAsia="Times New Roman" w:hAnsi="Times New Roman" w:cs="Times New Roman"/>
+          <w:b/>
+          <w:bCs/>
+          <w:kern w:val="0"/>
+          <w14:ligatures w14:val="none"/>
+        </w:rPr>
+        <w:drawing>
+          <wp:inline distT="0" distB="0" distL="0" distR="0" wp14:anchorId="59E4BB8A" wp14:editId="5833D255">
+            <wp:extent cx="4450279" cy="2250141"/>
+            <wp:effectExtent l="0" t="0" r="0" b="0"/>
+            <wp:docPr id="629552602" name="Picture 1"/>
+            <wp:cNvGraphicFramePr>
+              <a:graphicFrameLocks xmlns:a="http://schemas.openxmlformats.org/drawingml/2006/main" noChangeAspect="1"/>
+            </wp:cNvGraphicFramePr>
+            <a:graphic xmlns:a="http://schemas.openxmlformats.org/drawingml/2006/main">
+              <a:graphicData uri="http://schemas.openxmlformats.org/drawingml/2006/picture">
+                <pic:pic xmlns:pic="http://schemas.openxmlformats.org/drawingml/2006/picture">
+                  <pic:nvPicPr>
+                    <pic:cNvPr id="629552602" name="Picture 1"/>
+                    <pic:cNvPicPr/>
+                  </pic:nvPicPr>
+                  <pic:blipFill>
+                    <a:blip r:embed="rId14"/>
+                    <a:stretch>
+                      <a:fillRect/>
+                    </a:stretch>
+                  </pic:blipFill>
+                  <pic:spPr>
+                    <a:xfrm>
+                      <a:off x="0" y="0"/>
+                      <a:ext cx="4488571" cy="2269502"/>
+                    </a:xfrm>
+                    <a:prstGeom prst="rect">
+                      <a:avLst/>
+                    </a:prstGeom>
+                  </pic:spPr>
+                </pic:pic>
+              </a:graphicData>
+            </a:graphic>
+          </wp:inline>
+        </w:drawing>
+      </w:r>
+    </w:p>
+    <w:p>
+      <w:pPr>
+        <w:spacing w:after="0" w:line="240" w:lineRule="auto"/>
+        <w:rPr>
+          <w:rFonts w:ascii="Times New Roman" w:eastAsia="Times New Roman" w:hAnsi="Times New Roman" w:cs="Times New Roman"/>
+          <w:b/>
+          <w:bCs/>
+          <w:kern w:val="0"/>
+          <w14:ligatures w14:val="none"/>
+        </w:rPr>
+      </w:pPr>
+      <w:r>
+        <w:rPr>
+          <w:rFonts w:ascii="Times New Roman" w:eastAsia="Times New Roman" w:hAnsi="Times New Roman" w:cs="Times New Roman"/>
+          <w:b/>
+          <w:bCs/>
+          <w:kern w:val="0"/>
+          <w14:ligatures w14:val="none"/>
+        </w:rPr>
+        <w:drawing>
+          <wp:inline distT="0" distB="0" distL="0" distR="0" wp14:anchorId="54CC88DA" wp14:editId="12ED6FDA">
+            <wp:extent cx="4374777" cy="3848937"/>
+            <wp:effectExtent l="0" t="0" r="0" b="0"/>
+            <wp:docPr id="1500399131" name="Picture 1" descr="A screenshot of a chat&#10;&#10;AI-generated content may be incorrect."/>
+            <wp:cNvGraphicFramePr>
+              <a:graphicFrameLocks xmlns:a="http://schemas.openxmlformats.org/drawingml/2006/main" noChangeAspect="1"/>
+            </wp:cNvGraphicFramePr>
+            <a:graphic xmlns:a="http://schemas.openxmlformats.org/drawingml/2006/main">
+              <a:graphicData uri="http://schemas.openxmlformats.org/drawingml/2006/picture">
+                <pic:pic xmlns:pic="http://schemas.openxmlformats.org/drawingml/2006/picture">
+                  <pic:nvPicPr>
+                    <pic:cNvPr id="1500399131" name="Picture 1" descr="A screenshot of a chat&#10;&#10;AI-generated content may be incorrect."/>
+                    <pic:cNvPicPr/>
+                  </pic:nvPicPr>
+                  <pic:blipFill>
+                    <a:blip r:embed="rId15"/>
+                    <a:stretch>
+                      <a:fillRect/>
+                    </a:stretch>
+                  </pic:blipFill>
+                  <pic:spPr>
+                    <a:xfrm>
+                      <a:off x="0" y="0"/>
+                      <a:ext cx="4399852" cy="3870998"/>
+                    </a:xfrm>
+                    <a:prstGeom prst="rect">
+                      <a:avLst/>
+                    </a:prstGeom>
+                  </pic:spPr>
+                </pic:pic>
+              </a:graphicData>
+            </a:graphic>
+          </wp:inline>
+        </w:drawing>
+      </w:r>
+    </w:p>
+    <w:p>
+      <w:pPr>
+        <w:spacing w:after="0" w:line="240" w:lineRule="auto"/>
+        <w:rPr>
+          <w:rFonts w:ascii="Times New Roman" w:eastAsia="Times New Roman" w:hAnsi="Times New Roman" w:cs="Times New Roman"/>
+          <w:b/>
+          <w:bCs/>
+          <w:kern w:val="0"/>
+          <w14:ligatures w14:val="none"/>
+        </w:rPr>
+      </w:pPr>
+      <w:r>
+        <w:rPr>
+          <w:rFonts w:ascii="Times New Roman" w:eastAsia="Times New Roman" w:hAnsi="Times New Roman" w:cs="Times New Roman"/>
+          <w:b/>
+          <w:bCs/>
+          <w:kern w:val="0"/>
+          <w14:ligatures w14:val="none"/>
+        </w:rPr>
+        <w:drawing>
+          <wp:inline distT="0" distB="0" distL="0" distR="0" wp14:anchorId="784AEEA7" wp14:editId="5CC3DC9A">
+            <wp:extent cx="4406504" cy="2402541"/>
+            <wp:effectExtent l="0" t="0" r="635" b="0"/>
+            <wp:docPr id="1358989475" name="Picture 1" descr="A screenshot of a workflow&#10;&#10;AI-generated content may be incorrect."/>
+            <wp:cNvGraphicFramePr>
+              <a:graphicFrameLocks xmlns:a="http://schemas.openxmlformats.org/drawingml/2006/main" noChangeAspect="1"/>
+            </wp:cNvGraphicFramePr>
+            <a:graphic xmlns:a="http://schemas.openxmlformats.org/drawingml/2006/main">
+              <a:graphicData uri="http://schemas.openxmlformats.org/drawingml/2006/picture">
+                <pic:pic xmlns:pic="http://schemas.openxmlformats.org/drawingml/2006/picture">
+                  <pic:nvPicPr>
+                    <pic:cNvPr id="1358989475" name="Picture 1" descr="A screenshot of a workflow&#10;&#10;AI-generated content may be incorrect."/>
+                    <pic:cNvPicPr/>
+                  </pic:nvPicPr>
+                  <pic:blipFill>
+                    <a:blip r:embed="rId16"/>
+                    <a:stretch>
+                      <a:fillRect/>
+                    </a:stretch>
+                  </pic:blipFill>
+                  <pic:spPr>
+                    <a:xfrm>
+                      <a:off x="0" y="0"/>
+                      <a:ext cx="4436140" cy="2418699"/>
+                    </a:xfrm>
+                    <a:prstGeom prst="rect">
+                      <a:avLst/>
+                    </a:prstGeom>
+                  </pic:spPr>
+                </pic:pic>
+              </a:graphicData>
+            </a:graphic>
+          </wp:inline>
+        </w:drawing>
+      </w:r>
+    </w:p>
+    <w:p>
+      <w:pPr>
+        <w:spacing w:after="0" w:line="240" w:lineRule="auto"/>
+        <w:rPr>
+          <w:rFonts w:ascii="Times New Roman" w:eastAsia="Times New Roman" w:hAnsi="Times New Roman" w:cs="Times New Roman"/>
+          <w:b/>
+          <w:bCs/>
+          <w:kern w:val="0"/>
+          <w14:ligatures w14:val="none"/>
+        </w:rPr>
+      </w:pPr>
+    </w:p>
+    <w:p>
+      <w:pPr>
+        <w:spacing w:after="0" w:line="240" w:lineRule="auto"/>
+        <w:rPr>
+          <w:rFonts w:ascii="Times New Roman" w:eastAsia="Times New Roman" w:hAnsi="Times New Roman" w:cs="Times New Roman"/>
+          <w:kern w:val="0"/>
+          <w14:ligatures w14:val="none"/>
+        </w:rPr>
+      </w:pPr>
+      <w:r>
+        <w:rPr>
+          <w:rFonts w:ascii="Times New Roman" w:eastAsia="Times New Roman" w:hAnsi="Times New Roman" w:cs="Times New Roman"/>
+          <w:kern w:val="0"/>
+          <w14:ligatures w14:val="none"/>
+        </w:rPr>
+        <w:t>Summarizes the session:</w:t>
       </w:r>
     </w:p>
     <w:p>

</xml_diff>